<commit_message>
Major updates including the simulation studies
</commit_message>
<xml_diff>
--- a/doc/Recentering in Regression Models_JL.docx
+++ b/doc/Recentering in Regression Models_JL.docx
@@ -7022,11 +7022,13 @@
           </m:r>
           <w:commentRangeEnd w:id="166"/>
           <m:r>
-            <m:rPr>
-              <m:sty m:val="p"/>
-            </m:rPr>
             <w:rPr>
               <w:rStyle w:val="CommentReference"/>
+              <w:rFonts w:ascii="Cambria Math" w:hAnsi="Cambria Math"/>
+              <w:i/>
+              <w:sz w:val="24"/>
+              <w:szCs w:val="24"/>
+              <w:lang w:val="en-CA"/>
             </w:rPr>
             <w:commentReference w:id="166"/>
           </m:r>
@@ -8703,11 +8705,13 @@
                       <w:commentRangeEnd w:id="283"/>
                       <m:r>
                         <w:ins w:id="284" w:author="Juan Li" w:date="2025-10-27T13:50:00Z" w16du:dateUtc="2025-10-27T17:50:00Z">
-                          <m:rPr>
-                            <m:sty m:val="p"/>
-                          </m:rPr>
                           <w:rPr>
                             <w:rStyle w:val="CommentReference"/>
+                            <w:rFonts w:ascii="Cambria Math" w:hAnsi="Cambria Math"/>
+                            <w:i/>
+                            <w:sz w:val="24"/>
+                            <w:szCs w:val="24"/>
+                            <w:lang w:val="en-CA"/>
                           </w:rPr>
                           <w:commentReference w:id="283"/>
                         </w:ins>
@@ -14462,11 +14466,9 @@
       <w:pPr>
         <w:pStyle w:val="FirstParagraph"/>
       </w:pPr>
-      <w:proofErr w:type="gramStart"/>
       <w:r>
         <w:t>where</w:t>
       </w:r>
-      <w:proofErr w:type="gramEnd"/>
     </w:p>
     <w:p>
       <w:pPr>
@@ -15235,168 +15237,165 @@
         <w:pStyle w:val="Compact"/>
       </w:pPr>
       <w:commentRangeStart w:id="543"/>
-      <m:oMathPara>
-        <m:oMath>
-          <m:r>
-            <w:rPr>
-              <w:rFonts w:ascii="Cambria Math" w:hAnsi="Cambria Math"/>
-            </w:rPr>
-            <m:t>P</m:t>
-          </m:r>
-          <m:r>
-            <m:rPr>
-              <m:sty m:val="p"/>
-            </m:rPr>
-            <w:rPr>
-              <w:rFonts w:ascii="Cambria Math" w:hAnsi="Cambria Math"/>
-            </w:rPr>
-            <m:t>(</m:t>
-          </m:r>
-          <m:r>
-            <w:rPr>
-              <w:rFonts w:ascii="Cambria Math" w:hAnsi="Cambria Math"/>
-            </w:rPr>
-            <m:t>Y</m:t>
-          </m:r>
-          <m:r>
-            <m:rPr>
-              <m:sty m:val="p"/>
-            </m:rPr>
-            <w:rPr>
-              <w:rFonts w:ascii="Cambria Math" w:hAnsi="Cambria Math"/>
-            </w:rPr>
-            <m:t>=</m:t>
-          </m:r>
-          <m:r>
-            <w:rPr>
-              <w:rFonts w:ascii="Cambria Math" w:hAnsi="Cambria Math"/>
-            </w:rPr>
-            <m:t>1</m:t>
-          </m:r>
-          <m:r>
-            <m:rPr>
-              <m:sty m:val="p"/>
-            </m:rPr>
-            <w:rPr>
-              <w:rFonts w:ascii="Cambria Math" w:hAnsi="Cambria Math"/>
-            </w:rPr>
-            <m:t>∣</m:t>
-          </m:r>
-          <m:r>
-            <m:rPr>
-              <m:nor/>
-            </m:rPr>
-            <m:t>predictors at their means</m:t>
-          </m:r>
-          <m:r>
-            <m:rPr>
-              <m:sty m:val="p"/>
-            </m:rPr>
-            <w:rPr>
-              <w:rFonts w:ascii="Cambria Math" w:hAnsi="Cambria Math"/>
-            </w:rPr>
-            <m:t>)=</m:t>
-          </m:r>
-          <m:sSup>
-            <m:sSupPr>
-              <m:ctrlPr>
-                <w:rPr>
-                  <w:rFonts w:ascii="Cambria Math" w:hAnsi="Cambria Math"/>
-                </w:rPr>
-              </m:ctrlPr>
-            </m:sSupPr>
-            <m:e>
-              <m:r>
-                <m:rPr>
-                  <m:nor/>
-                </m:rPr>
-                <m:t>logit</m:t>
-              </m:r>
-            </m:e>
-            <m:sup>
-              <m:r>
-                <m:rPr>
-                  <m:sty m:val="p"/>
-                </m:rPr>
-                <w:rPr>
-                  <w:rFonts w:ascii="Cambria Math" w:hAnsi="Cambria Math"/>
-                </w:rPr>
-                <m:t>-</m:t>
-              </m:r>
-              <m:r>
-                <w:rPr>
-                  <w:rFonts w:ascii="Cambria Math" w:hAnsi="Cambria Math"/>
-                </w:rPr>
-                <m:t>1</m:t>
-              </m:r>
-            </m:sup>
-          </m:sSup>
-          <m:r>
-            <m:rPr>
-              <m:sty m:val="p"/>
-            </m:rPr>
-            <w:rPr>
-              <w:rFonts w:ascii="Cambria Math" w:hAnsi="Cambria Math"/>
-            </w:rPr>
-            <m:t>(</m:t>
-          </m:r>
-          <m:sSubSup>
-            <m:sSubSupPr>
-              <m:ctrlPr>
-                <w:rPr>
-                  <w:rFonts w:ascii="Cambria Math" w:hAnsi="Cambria Math"/>
-                </w:rPr>
-              </m:ctrlPr>
-            </m:sSubSupPr>
-            <m:e>
-              <m:r>
-                <w:rPr>
-                  <w:rFonts w:ascii="Cambria Math" w:hAnsi="Cambria Math"/>
-                </w:rPr>
-                <m:t>β</m:t>
-              </m:r>
-            </m:e>
-            <m:sub>
-              <m:r>
-                <w:rPr>
-                  <w:rFonts w:ascii="Cambria Math" w:hAnsi="Cambria Math"/>
-                </w:rPr>
-                <m:t>0</m:t>
-              </m:r>
-            </m:sub>
-            <m:sup>
-              <m:r>
-                <m:rPr>
-                  <m:sty m:val="p"/>
-                </m:rPr>
-                <w:rPr>
-                  <w:rFonts w:ascii="Cambria Math" w:hAnsi="Cambria Math"/>
-                </w:rPr>
-                <m:t>'</m:t>
-              </m:r>
-            </m:sup>
-          </m:sSubSup>
-          <m:r>
-            <m:rPr>
-              <m:sty m:val="p"/>
-            </m:rPr>
-            <w:rPr>
-              <w:rFonts w:ascii="Cambria Math" w:hAnsi="Cambria Math"/>
-            </w:rPr>
-            <m:t>)</m:t>
-          </m:r>
-          <w:commentRangeEnd w:id="543"/>
-          <m:r>
-            <m:rPr>
-              <m:sty m:val="p"/>
-            </m:rPr>
-            <w:rPr>
-              <w:rStyle w:val="CommentReference"/>
-            </w:rPr>
-            <w:commentReference w:id="543"/>
-          </m:r>
-        </m:oMath>
-      </m:oMathPara>
+      <m:oMath>
+        <m:r>
+          <w:rPr>
+            <w:rFonts w:ascii="Cambria Math" w:hAnsi="Cambria Math"/>
+          </w:rPr>
+          <m:t>P</m:t>
+        </m:r>
+        <m:r>
+          <m:rPr>
+            <m:sty m:val="p"/>
+          </m:rPr>
+          <w:rPr>
+            <w:rFonts w:ascii="Cambria Math" w:hAnsi="Cambria Math"/>
+          </w:rPr>
+          <m:t>(</m:t>
+        </m:r>
+        <m:r>
+          <w:rPr>
+            <w:rFonts w:ascii="Cambria Math" w:hAnsi="Cambria Math"/>
+          </w:rPr>
+          <m:t>Y</m:t>
+        </m:r>
+        <m:r>
+          <m:rPr>
+            <m:sty m:val="p"/>
+          </m:rPr>
+          <w:rPr>
+            <w:rFonts w:ascii="Cambria Math" w:hAnsi="Cambria Math"/>
+          </w:rPr>
+          <m:t>=</m:t>
+        </m:r>
+        <m:r>
+          <w:rPr>
+            <w:rFonts w:ascii="Cambria Math" w:hAnsi="Cambria Math"/>
+          </w:rPr>
+          <m:t>1</m:t>
+        </m:r>
+        <m:r>
+          <m:rPr>
+            <m:sty m:val="p"/>
+          </m:rPr>
+          <w:rPr>
+            <w:rFonts w:ascii="Cambria Math" w:hAnsi="Cambria Math"/>
+          </w:rPr>
+          <m:t>∣</m:t>
+        </m:r>
+        <m:r>
+          <m:rPr>
+            <m:nor/>
+          </m:rPr>
+          <m:t>predictors at their means</m:t>
+        </m:r>
+        <m:r>
+          <m:rPr>
+            <m:sty m:val="p"/>
+          </m:rPr>
+          <w:rPr>
+            <w:rFonts w:ascii="Cambria Math" w:hAnsi="Cambria Math"/>
+          </w:rPr>
+          <m:t>)=</m:t>
+        </m:r>
+        <m:sSup>
+          <m:sSupPr>
+            <m:ctrlPr>
+              <w:rPr>
+                <w:rFonts w:ascii="Cambria Math" w:hAnsi="Cambria Math"/>
+              </w:rPr>
+            </m:ctrlPr>
+          </m:sSupPr>
+          <m:e>
+            <m:r>
+              <m:rPr>
+                <m:nor/>
+              </m:rPr>
+              <m:t>logit</m:t>
+            </m:r>
+          </m:e>
+          <m:sup>
+            <m:r>
+              <m:rPr>
+                <m:sty m:val="p"/>
+              </m:rPr>
+              <w:rPr>
+                <w:rFonts w:ascii="Cambria Math" w:hAnsi="Cambria Math"/>
+              </w:rPr>
+              <m:t>-</m:t>
+            </m:r>
+            <m:r>
+              <w:rPr>
+                <w:rFonts w:ascii="Cambria Math" w:hAnsi="Cambria Math"/>
+              </w:rPr>
+              <m:t>1</m:t>
+            </m:r>
+          </m:sup>
+        </m:sSup>
+        <m:r>
+          <m:rPr>
+            <m:sty m:val="p"/>
+          </m:rPr>
+          <w:rPr>
+            <w:rFonts w:ascii="Cambria Math" w:hAnsi="Cambria Math"/>
+          </w:rPr>
+          <m:t>(</m:t>
+        </m:r>
+        <m:sSubSup>
+          <m:sSubSupPr>
+            <m:ctrlPr>
+              <w:rPr>
+                <w:rFonts w:ascii="Cambria Math" w:hAnsi="Cambria Math"/>
+              </w:rPr>
+            </m:ctrlPr>
+          </m:sSubSupPr>
+          <m:e>
+            <m:r>
+              <w:rPr>
+                <w:rFonts w:ascii="Cambria Math" w:hAnsi="Cambria Math"/>
+              </w:rPr>
+              <m:t>β</m:t>
+            </m:r>
+          </m:e>
+          <m:sub>
+            <m:r>
+              <w:rPr>
+                <w:rFonts w:ascii="Cambria Math" w:hAnsi="Cambria Math"/>
+              </w:rPr>
+              <m:t>0</m:t>
+            </m:r>
+          </m:sub>
+          <m:sup>
+            <m:r>
+              <m:rPr>
+                <m:sty m:val="p"/>
+              </m:rPr>
+              <w:rPr>
+                <w:rFonts w:ascii="Cambria Math" w:hAnsi="Cambria Math"/>
+              </w:rPr>
+              <m:t>'</m:t>
+            </m:r>
+          </m:sup>
+        </m:sSubSup>
+        <m:r>
+          <m:rPr>
+            <m:sty m:val="p"/>
+          </m:rPr>
+          <w:rPr>
+            <w:rFonts w:ascii="Cambria Math" w:hAnsi="Cambria Math"/>
+          </w:rPr>
+          <m:t>)</m:t>
+        </m:r>
+      </m:oMath>
+      <w:commentRangeEnd w:id="543"/>
+      <w:r>
+        <w:rPr>
+          <w:rStyle w:val="CommentReference"/>
+          <w:sz w:val="24"/>
+          <w:szCs w:val="24"/>
+        </w:rPr>
+        <w:commentReference w:id="543"/>
+      </w:r>
     </w:p>
     <w:p>
       <w:pPr>
@@ -17684,21 +17683,91 @@
         <w:rPr>
           <w:rStyle w:val="CommentTok"/>
         </w:rPr>
-        <w:t xml:space="preserve"># betas: vector of slope coefficients (same length as </w:t>
-      </w:r>
-      <w:proofErr w:type="spellStart"/>
+        <w:t># betas: vector of slope coefficients (same length as ncol(X))</w:t>
+      </w:r>
+      <w:r>
+        <w:br/>
+      </w:r>
+      <w:r>
+        <w:rPr>
+          <w:rStyle w:val="NormalTok"/>
+        </w:rPr>
+        <w:t xml:space="preserve">  </w:t>
+      </w:r>
+      <w:r>
+        <w:br/>
+      </w:r>
+      <w:r>
+        <w:rPr>
+          <w:rStyle w:val="NormalTok"/>
+        </w:rPr>
+        <w:t xml:space="preserve">  </w:t>
+      </w:r>
       <w:r>
         <w:rPr>
           <w:rStyle w:val="CommentTok"/>
         </w:rPr>
-        <w:t>ncol</w:t>
-      </w:r>
-      <w:proofErr w:type="spellEnd"/>
+        <w:t># Compute sample mean of Y</w:t>
+      </w:r>
+      <w:r>
+        <w:br/>
+      </w:r>
+      <w:r>
+        <w:rPr>
+          <w:rStyle w:val="NormalTok"/>
+        </w:rPr>
+        <w:t xml:space="preserve">  Ybar </w:t>
+      </w:r>
+      <w:r>
+        <w:rPr>
+          <w:rStyle w:val="NormalTok"/>
+        </w:rPr>
+        <w:t>&lt;-</w:t>
+      </w:r>
+      <w:r>
+        <w:rPr>
+          <w:rStyle w:val="NormalTok"/>
+        </w:rPr>
+        <w:t xml:space="preserve"> </w:t>
+      </w:r>
+      <w:r>
+        <w:rPr>
+          <w:rStyle w:val="NormalTok"/>
+        </w:rPr>
+        <w:t>mean</w:t>
+      </w:r>
+      <w:r>
+        <w:rPr>
+          <w:rStyle w:val="NormalTok"/>
+        </w:rPr>
+        <w:t>(Y)</w:t>
+      </w:r>
+      <w:r>
+        <w:rPr>
+          <w:rStyle w:val="NormalTok"/>
+        </w:rPr>
+        <w:br/>
+      </w:r>
+      <w:r>
+        <w:rPr>
+          <w:rStyle w:val="NormalTok"/>
+        </w:rPr>
+        <w:t xml:space="preserve">  </w:t>
+      </w:r>
+      <w:r>
+        <w:br/>
+      </w:r>
+      <w:r>
+        <w:rPr>
+          <w:rStyle w:val="NormalTok"/>
+        </w:rPr>
+        <w:t xml:space="preserve">  </w:t>
+      </w:r>
       <w:r>
         <w:rPr>
           <w:rStyle w:val="CommentTok"/>
         </w:rPr>
-        <w:t>(X))</w:t>
+        <w:t># Compute linear predictor excluding intercept</w:t>
       </w:r>
       <w:r>
         <w:br/>
@@ -17707,126 +17776,26 @@
         <w:rPr>
           <w:rStyle w:val="NormalTok"/>
         </w:rPr>
-        <w:t xml:space="preserve">  </w:t>
-      </w:r>
-      <w:r>
-        <w:br/>
+        <w:t xml:space="preserve">  eta </w:t>
       </w:r>
       <w:r>
         <w:rPr>
           <w:rStyle w:val="NormalTok"/>
         </w:rPr>
-        <w:t xml:space="preserve">  </w:t>
-      </w:r>
-      <w:r>
-        <w:rPr>
-          <w:rStyle w:val="CommentTok"/>
-        </w:rPr>
-        <w:t># Compute sample mean of Y</w:t>
-      </w:r>
-      <w:r>
-        <w:br/>
+        <w:t>&lt;-</w:t>
       </w:r>
       <w:r>
         <w:rPr>
           <w:rStyle w:val="NormalTok"/>
         </w:rPr>
-        <w:t xml:space="preserve">  </w:t>
-      </w:r>
-      <w:proofErr w:type="spellStart"/>
+        <w:t xml:space="preserve"> </w:t>
+      </w:r>
       <w:r>
         <w:rPr>
           <w:rStyle w:val="NormalTok"/>
         </w:rPr>
-        <w:t>Ybar</w:t>
-      </w:r>
-      <w:proofErr w:type="spellEnd"/>
-      <w:r>
-        <w:rPr>
-          <w:rStyle w:val="NormalTok"/>
-        </w:rPr>
-        <w:t xml:space="preserve"> </w:t>
-      </w:r>
-      <w:r>
-        <w:rPr>
-          <w:rStyle w:val="NormalTok"/>
-        </w:rPr>
-        <w:t>&lt;-</w:t>
-      </w:r>
-      <w:r>
-        <w:rPr>
-          <w:rStyle w:val="NormalTok"/>
-        </w:rPr>
-        <w:t xml:space="preserve"> </w:t>
-      </w:r>
-      <w:r>
-        <w:rPr>
-          <w:rStyle w:val="NormalTok"/>
-        </w:rPr>
-        <w:t>mean</w:t>
-      </w:r>
-      <w:r>
-        <w:rPr>
-          <w:rStyle w:val="NormalTok"/>
-        </w:rPr>
-        <w:t>(Y)</w:t>
-      </w:r>
-      <w:r>
-        <w:rPr>
-          <w:rStyle w:val="NormalTok"/>
-        </w:rPr>
-        <w:br/>
-      </w:r>
-      <w:r>
-        <w:rPr>
-          <w:rStyle w:val="NormalTok"/>
-        </w:rPr>
-        <w:t xml:space="preserve">  </w:t>
-      </w:r>
-      <w:r>
-        <w:br/>
-      </w:r>
-      <w:r>
-        <w:rPr>
-          <w:rStyle w:val="NormalTok"/>
-        </w:rPr>
-        <w:t xml:space="preserve">  </w:t>
-      </w:r>
-      <w:r>
-        <w:rPr>
-          <w:rStyle w:val="CommentTok"/>
-        </w:rPr>
-        <w:t># Compute linear predictor excluding intercept</w:t>
-      </w:r>
-      <w:r>
-        <w:br/>
-      </w:r>
-      <w:r>
-        <w:rPr>
-          <w:rStyle w:val="NormalTok"/>
-        </w:rPr>
-        <w:t xml:space="preserve">  eta </w:t>
-      </w:r>
-      <w:r>
-        <w:rPr>
-          <w:rStyle w:val="NormalTok"/>
-        </w:rPr>
-        <w:t>&lt;-</w:t>
-      </w:r>
-      <w:r>
-        <w:rPr>
-          <w:rStyle w:val="NormalTok"/>
-        </w:rPr>
-        <w:t xml:space="preserve"> </w:t>
-      </w:r>
-      <w:proofErr w:type="spellStart"/>
-      <w:r>
-        <w:rPr>
-          <w:rStyle w:val="NormalTok"/>
-        </w:rPr>
         <w:t>as.numeric</w:t>
       </w:r>
-      <w:proofErr w:type="spellEnd"/>
       <w:r>
         <w:rPr>
           <w:rStyle w:val="NormalTok"/>
@@ -18003,30 +17972,8 @@
         <w:rPr>
           <w:rStyle w:val="CommentTok"/>
         </w:rPr>
-        <w:t># Define function f(b) = sum(</w:t>
-      </w:r>
-      <w:proofErr w:type="spellStart"/>
-      <w:r>
-        <w:rPr>
-          <w:rStyle w:val="CommentTok"/>
-        </w:rPr>
-        <w:t>p_i</w:t>
-      </w:r>
-      <w:proofErr w:type="spellEnd"/>
-      <w:r>
-        <w:rPr>
-          <w:rStyle w:val="CommentTok"/>
-        </w:rPr>
-        <w:t>) - n*</w:t>
-      </w:r>
-      <w:proofErr w:type="spellStart"/>
-      <w:r>
-        <w:rPr>
-          <w:rStyle w:val="CommentTok"/>
-        </w:rPr>
-        <w:t>Ybar</w:t>
-      </w:r>
-      <w:proofErr w:type="spellEnd"/>
+        <w:t># Define function f(b) = sum(p_i) - n*Ybar</w:t>
+      </w:r>
       <w:r>
         <w:br/>
       </w:r>
@@ -18131,20 +18078,21 @@
         <w:rPr>
           <w:rStyle w:val="NormalTok"/>
         </w:rPr>
-        <w:t xml:space="preserve"> </w:t>
-      </w:r>
-      <w:proofErr w:type="spellStart"/>
+        <w:t xml:space="preserve"> Ybar</w:t>
+      </w:r>
       <w:r>
         <w:rPr>
           <w:rStyle w:val="NormalTok"/>
         </w:rPr>
-        <w:t>Ybar</w:t>
-      </w:r>
-      <w:proofErr w:type="spellEnd"/>
+        <w:br/>
+      </w:r>
       <w:r>
         <w:rPr>
           <w:rStyle w:val="NormalTok"/>
         </w:rPr>
+        <w:t xml:space="preserve">  </w:t>
+      </w:r>
+      <w:r>
         <w:br/>
       </w:r>
       <w:r>
@@ -18154,42 +18102,19 @@
         <w:t xml:space="preserve">  </w:t>
       </w:r>
       <w:r>
+        <w:rPr>
+          <w:rStyle w:val="CommentTok"/>
+        </w:rPr>
+        <w:t># Derivative f'(b)</w:t>
+      </w:r>
+      <w:r>
         <w:br/>
       </w:r>
       <w:r>
         <w:rPr>
           <w:rStyle w:val="NormalTok"/>
         </w:rPr>
-        <w:t xml:space="preserve">  </w:t>
-      </w:r>
-      <w:r>
-        <w:rPr>
-          <w:rStyle w:val="CommentTok"/>
-        </w:rPr>
-        <w:t># Derivative f'(b)</w:t>
-      </w:r>
-      <w:r>
-        <w:br/>
-      </w:r>
-      <w:r>
-        <w:rPr>
-          <w:rStyle w:val="NormalTok"/>
-        </w:rPr>
-        <w:t xml:space="preserve">  </w:t>
-      </w:r>
-      <w:proofErr w:type="spellStart"/>
-      <w:r>
-        <w:rPr>
-          <w:rStyle w:val="NormalTok"/>
-        </w:rPr>
-        <w:t>fprime</w:t>
-      </w:r>
-      <w:proofErr w:type="spellEnd"/>
-      <w:r>
-        <w:rPr>
-          <w:rStyle w:val="NormalTok"/>
-        </w:rPr>
-        <w:t xml:space="preserve"> </w:t>
+        <w:t xml:space="preserve">  fprime </w:t>
       </w:r>
       <w:r>
         <w:rPr>
@@ -18357,33 +18282,17 @@
         </w:rPr>
         <w:t xml:space="preserve"> </w:t>
       </w:r>
-      <w:proofErr w:type="spellStart"/>
       <w:r>
         <w:rPr>
           <w:rStyle w:val="NormalTok"/>
         </w:rPr>
         <w:t>qlogis</w:t>
       </w:r>
-      <w:proofErr w:type="spellEnd"/>
       <w:r>
         <w:rPr>
           <w:rStyle w:val="NormalTok"/>
         </w:rPr>
-        <w:t>(</w:t>
-      </w:r>
-      <w:proofErr w:type="spellStart"/>
-      <w:r>
-        <w:rPr>
-          <w:rStyle w:val="NormalTok"/>
-        </w:rPr>
-        <w:t>Ybar</w:t>
-      </w:r>
-      <w:proofErr w:type="spellEnd"/>
-      <w:r>
-        <w:rPr>
-          <w:rStyle w:val="NormalTok"/>
-        </w:rPr>
-        <w:t xml:space="preserve">)  </w:t>
+        <w:t xml:space="preserve">(Ybar)  </w:t>
       </w:r>
       <w:r>
         <w:rPr>
@@ -18448,39 +18357,49 @@
         <w:rPr>
           <w:rStyle w:val="NormalTok"/>
         </w:rPr>
-        <w:t xml:space="preserve">    </w:t>
-      </w:r>
-      <w:proofErr w:type="spellStart"/>
+        <w:t xml:space="preserve">    b_new </w:t>
+      </w:r>
       <w:r>
         <w:rPr>
           <w:rStyle w:val="NormalTok"/>
         </w:rPr>
-        <w:t>b_new</w:t>
-      </w:r>
-      <w:proofErr w:type="spellEnd"/>
+        <w:t>&lt;-</w:t>
+      </w:r>
       <w:r>
         <w:rPr>
           <w:rStyle w:val="NormalTok"/>
         </w:rPr>
+        <w:t xml:space="preserve"> b </w:t>
+      </w:r>
+      <w:r>
+        <w:rPr>
+          <w:rStyle w:val="NormalTok"/>
+        </w:rPr>
+        <w:t>-</w:t>
+      </w:r>
+      <w:r>
+        <w:rPr>
+          <w:rStyle w:val="NormalTok"/>
+        </w:rPr>
         <w:t xml:space="preserve"> </w:t>
       </w:r>
       <w:r>
         <w:rPr>
           <w:rStyle w:val="NormalTok"/>
         </w:rPr>
-        <w:t>&lt;-</w:t>
+        <w:t>f</w:t>
       </w:r>
       <w:r>
         <w:rPr>
           <w:rStyle w:val="NormalTok"/>
         </w:rPr>
-        <w:t xml:space="preserve"> b </w:t>
+        <w:t xml:space="preserve">(b) </w:t>
       </w:r>
       <w:r>
         <w:rPr>
           <w:rStyle w:val="NormalTok"/>
         </w:rPr>
-        <w:t>-</w:t>
+        <w:t>/</w:t>
       </w:r>
       <w:r>
         <w:rPr>
@@ -18492,34 +18411,8 @@
         <w:rPr>
           <w:rStyle w:val="NormalTok"/>
         </w:rPr>
-        <w:t>f</w:t>
-      </w:r>
-      <w:r>
-        <w:rPr>
-          <w:rStyle w:val="NormalTok"/>
-        </w:rPr>
-        <w:t xml:space="preserve">(b) </w:t>
-      </w:r>
-      <w:r>
-        <w:rPr>
-          <w:rStyle w:val="NormalTok"/>
-        </w:rPr>
-        <w:t>/</w:t>
-      </w:r>
-      <w:r>
-        <w:rPr>
-          <w:rStyle w:val="NormalTok"/>
-        </w:rPr>
-        <w:t xml:space="preserve"> </w:t>
-      </w:r>
-      <w:proofErr w:type="spellStart"/>
-      <w:r>
-        <w:rPr>
-          <w:rStyle w:val="NormalTok"/>
-        </w:rPr>
         <w:t>fprime</w:t>
       </w:r>
-      <w:proofErr w:type="spellEnd"/>
       <w:r>
         <w:rPr>
           <w:rStyle w:val="NormalTok"/>
@@ -18561,21 +18454,7 @@
         <w:rPr>
           <w:rStyle w:val="NormalTok"/>
         </w:rPr>
-        <w:t>(</w:t>
-      </w:r>
-      <w:proofErr w:type="spellStart"/>
-      <w:r>
-        <w:rPr>
-          <w:rStyle w:val="NormalTok"/>
-        </w:rPr>
-        <w:t>b_new</w:t>
-      </w:r>
-      <w:proofErr w:type="spellEnd"/>
-      <w:r>
-        <w:rPr>
-          <w:rStyle w:val="NormalTok"/>
-        </w:rPr>
-        <w:t xml:space="preserve"> </w:t>
+        <w:t xml:space="preserve">(b_new </w:t>
       </w:r>
       <w:r>
         <w:rPr>
@@ -18642,16 +18521,8 @@
         <w:rPr>
           <w:rStyle w:val="NormalTok"/>
         </w:rPr>
-        <w:t xml:space="preserve"> </w:t>
-      </w:r>
-      <w:proofErr w:type="spellStart"/>
-      <w:r>
-        <w:rPr>
-          <w:rStyle w:val="NormalTok"/>
-        </w:rPr>
-        <w:t>b_new</w:t>
-      </w:r>
-      <w:proofErr w:type="spellEnd"/>
+        <w:t xml:space="preserve"> b_new</w:t>
+      </w:r>
       <w:r>
         <w:rPr>
           <w:rStyle w:val="NormalTok"/>
@@ -20995,7 +20866,6 @@
       <w:r>
         <w:t xml:space="preserve">You can get this new baseline hazard and survival easily from a fitted </w:t>
       </w:r>
-      <w:proofErr w:type="spellStart"/>
       <w:r>
         <w:rPr>
           <w:rStyle w:val="VerbatimChar"/>
@@ -21008,7 +20878,6 @@
         </w:rPr>
         <w:t>ph</w:t>
       </w:r>
-      <w:proofErr w:type="spellEnd"/>
       <w:r>
         <w:t xml:space="preserve"> model. Here is the R code:</w:t>
       </w:r>
@@ -21068,28 +20937,24 @@
         </w:rPr>
         <w:t xml:space="preserve"> </w:t>
       </w:r>
-      <w:proofErr w:type="spellStart"/>
       <w:r>
         <w:rPr>
           <w:rStyle w:val="NormalTok"/>
         </w:rPr>
         <w:t>coxph</w:t>
       </w:r>
-      <w:proofErr w:type="spellEnd"/>
       <w:r>
         <w:rPr>
           <w:rStyle w:val="NormalTok"/>
         </w:rPr>
         <w:t>(</w:t>
       </w:r>
-      <w:proofErr w:type="spellStart"/>
       <w:r>
         <w:rPr>
           <w:rStyle w:val="NormalTok"/>
         </w:rPr>
         <w:t>Surv</w:t>
       </w:r>
-      <w:proofErr w:type="spellEnd"/>
       <w:r>
         <w:rPr>
           <w:rStyle w:val="NormalTok"/>
@@ -21130,138 +20995,110 @@
         <w:rPr>
           <w:rStyle w:val="NormalTok"/>
         </w:rPr>
+        <w:t xml:space="preserve"> ph.ecog, </w:t>
+      </w:r>
+      <w:r>
+        <w:rPr>
+          <w:rStyle w:val="NormalTok"/>
+        </w:rPr>
+        <w:t>data =</w:t>
+      </w:r>
+      <w:r>
+        <w:rPr>
+          <w:rStyle w:val="NormalTok"/>
+        </w:rPr>
+        <w:t xml:space="preserve"> lung)</w:t>
+      </w:r>
+      <w:r>
+        <w:rPr>
+          <w:rStyle w:val="NormalTok"/>
+        </w:rPr>
+        <w:br/>
+      </w:r>
+      <w:r>
+        <w:br/>
+      </w:r>
+      <w:r>
+        <w:rPr>
+          <w:rStyle w:val="CommentTok"/>
+        </w:rPr>
+        <w:t># Extract coefficients and covariate means</w:t>
+      </w:r>
+      <w:r>
+        <w:br/>
+      </w:r>
+      <w:r>
+        <w:rPr>
+          <w:rStyle w:val="NormalTok"/>
+        </w:rPr>
+        <w:t xml:space="preserve">beta </w:t>
+      </w:r>
+      <w:r>
+        <w:rPr>
+          <w:rStyle w:val="NormalTok"/>
+        </w:rPr>
+        <w:t>&lt;-</w:t>
+      </w:r>
+      <w:r>
+        <w:rPr>
+          <w:rStyle w:val="NormalTok"/>
+        </w:rPr>
         <w:t xml:space="preserve"> </w:t>
       </w:r>
-      <w:proofErr w:type="spellStart"/>
       <w:r>
         <w:rPr>
           <w:rStyle w:val="NormalTok"/>
         </w:rPr>
-        <w:t>ph.ecog</w:t>
-      </w:r>
-      <w:proofErr w:type="spellEnd"/>
+        <w:t>coef</w:t>
+      </w:r>
       <w:r>
         <w:rPr>
           <w:rStyle w:val="NormalTok"/>
         </w:rPr>
-        <w:t xml:space="preserve">, </w:t>
+        <w:t>(fit)</w:t>
       </w:r>
       <w:r>
         <w:rPr>
           <w:rStyle w:val="NormalTok"/>
         </w:rPr>
-        <w:t>data =</w:t>
+        <w:br/>
       </w:r>
       <w:r>
         <w:rPr>
           <w:rStyle w:val="NormalTok"/>
         </w:rPr>
-        <w:t xml:space="preserve"> lung)</w:t>
+        <w:t xml:space="preserve">Xbar </w:t>
       </w:r>
       <w:r>
         <w:rPr>
           <w:rStyle w:val="NormalTok"/>
         </w:rPr>
-        <w:br/>
-      </w:r>
-      <w:r>
-        <w:br/>
-      </w:r>
-      <w:r>
-        <w:rPr>
-          <w:rStyle w:val="CommentTok"/>
-        </w:rPr>
-        <w:t># Extract coefficients and covariate means</w:t>
-      </w:r>
-      <w:r>
-        <w:br/>
+        <w:t>&lt;-</w:t>
       </w:r>
       <w:r>
         <w:rPr>
           <w:rStyle w:val="NormalTok"/>
         </w:rPr>
-        <w:t xml:space="preserve">beta </w:t>
+        <w:t xml:space="preserve"> </w:t>
       </w:r>
       <w:r>
         <w:rPr>
           <w:rStyle w:val="NormalTok"/>
         </w:rPr>
-        <w:t>&lt;-</w:t>
+        <w:t>colMeans</w:t>
       </w:r>
       <w:r>
         <w:rPr>
           <w:rStyle w:val="NormalTok"/>
         </w:rPr>
-        <w:t xml:space="preserve"> </w:t>
-      </w:r>
-      <w:proofErr w:type="spellStart"/>
+        <w:t>(</w:t>
+      </w:r>
       <w:r>
         <w:rPr>
           <w:rStyle w:val="NormalTok"/>
         </w:rPr>
-        <w:t>coef</w:t>
-      </w:r>
-      <w:proofErr w:type="spellEnd"/>
-      <w:r>
-        <w:rPr>
-          <w:rStyle w:val="NormalTok"/>
-        </w:rPr>
-        <w:t>(fit)</w:t>
-      </w:r>
-      <w:r>
-        <w:rPr>
-          <w:rStyle w:val="NormalTok"/>
-        </w:rPr>
-        <w:br/>
-      </w:r>
-      <w:proofErr w:type="spellStart"/>
-      <w:r>
-        <w:rPr>
-          <w:rStyle w:val="NormalTok"/>
-        </w:rPr>
-        <w:t>Xbar</w:t>
-      </w:r>
-      <w:proofErr w:type="spellEnd"/>
-      <w:r>
-        <w:rPr>
-          <w:rStyle w:val="NormalTok"/>
-        </w:rPr>
-        <w:t xml:space="preserve"> </w:t>
-      </w:r>
-      <w:r>
-        <w:rPr>
-          <w:rStyle w:val="NormalTok"/>
-        </w:rPr>
-        <w:t>&lt;-</w:t>
-      </w:r>
-      <w:r>
-        <w:rPr>
-          <w:rStyle w:val="NormalTok"/>
-        </w:rPr>
-        <w:t xml:space="preserve"> </w:t>
-      </w:r>
-      <w:proofErr w:type="spellStart"/>
-      <w:r>
-        <w:rPr>
-          <w:rStyle w:val="NormalTok"/>
-        </w:rPr>
-        <w:t>colMeans</w:t>
-      </w:r>
-      <w:proofErr w:type="spellEnd"/>
-      <w:r>
-        <w:rPr>
-          <w:rStyle w:val="NormalTok"/>
-        </w:rPr>
-        <w:t>(</w:t>
-      </w:r>
-      <w:proofErr w:type="spellStart"/>
-      <w:r>
-        <w:rPr>
-          <w:rStyle w:val="NormalTok"/>
-        </w:rPr>
         <w:t>model.matrix</w:t>
       </w:r>
-      <w:proofErr w:type="spellEnd"/>
       <w:r>
         <w:rPr>
           <w:rStyle w:val="NormalTok"/>
@@ -21302,24 +21139,88 @@
       <w:r>
         <w:br/>
       </w:r>
-      <w:proofErr w:type="spellStart"/>
       <w:r>
         <w:rPr>
           <w:rStyle w:val="NormalTok"/>
         </w:rPr>
-        <w:t>scale_factor</w:t>
-      </w:r>
-      <w:proofErr w:type="spellEnd"/>
+        <w:t xml:space="preserve">scale_factor </w:t>
+      </w:r>
       <w:r>
         <w:rPr>
           <w:rStyle w:val="NormalTok"/>
         </w:rPr>
+        <w:t>&lt;-</w:t>
+      </w:r>
+      <w:r>
+        <w:rPr>
+          <w:rStyle w:val="NormalTok"/>
+        </w:rPr>
         <w:t xml:space="preserve"> </w:t>
       </w:r>
       <w:r>
         <w:rPr>
           <w:rStyle w:val="NormalTok"/>
         </w:rPr>
+        <w:t>exp</w:t>
+      </w:r>
+      <w:r>
+        <w:rPr>
+          <w:rStyle w:val="NormalTok"/>
+        </w:rPr>
+        <w:t>(</w:t>
+      </w:r>
+      <w:r>
+        <w:rPr>
+          <w:rStyle w:val="NormalTok"/>
+        </w:rPr>
+        <w:t>sum</w:t>
+      </w:r>
+      <w:r>
+        <w:rPr>
+          <w:rStyle w:val="NormalTok"/>
+        </w:rPr>
+        <w:t xml:space="preserve">(beta </w:t>
+      </w:r>
+      <w:r>
+        <w:rPr>
+          <w:rStyle w:val="NormalTok"/>
+        </w:rPr>
+        <w:t>*</w:t>
+      </w:r>
+      <w:r>
+        <w:rPr>
+          <w:rStyle w:val="NormalTok"/>
+        </w:rPr>
+        <w:t xml:space="preserve"> Xbar))</w:t>
+      </w:r>
+      <w:r>
+        <w:rPr>
+          <w:rStyle w:val="NormalTok"/>
+        </w:rPr>
+        <w:br/>
+      </w:r>
+      <w:r>
+        <w:br/>
+      </w:r>
+      <w:r>
+        <w:rPr>
+          <w:rStyle w:val="CommentTok"/>
+        </w:rPr>
+        <w:t># Get baseline hazard from the fitted model</w:t>
+      </w:r>
+      <w:r>
+        <w:br/>
+      </w:r>
+      <w:r>
+        <w:rPr>
+          <w:rStyle w:val="NormalTok"/>
+        </w:rPr>
+        <w:t xml:space="preserve">base_haz </w:t>
+      </w:r>
+      <w:r>
+        <w:rPr>
+          <w:rStyle w:val="NormalTok"/>
+        </w:rPr>
         <w:t>&lt;-</w:t>
       </w:r>
       <w:r>
@@ -21332,236 +21233,110 @@
         <w:rPr>
           <w:rStyle w:val="NormalTok"/>
         </w:rPr>
-        <w:t>exp</w:t>
+        <w:t>basehaz</w:t>
       </w:r>
       <w:r>
         <w:rPr>
           <w:rStyle w:val="NormalTok"/>
         </w:rPr>
-        <w:t>(</w:t>
+        <w:t xml:space="preserve">(fit, </w:t>
       </w:r>
       <w:r>
         <w:rPr>
           <w:rStyle w:val="NormalTok"/>
         </w:rPr>
-        <w:t>sum</w:t>
+        <w:t>centered =</w:t>
       </w:r>
       <w:r>
         <w:rPr>
           <w:rStyle w:val="NormalTok"/>
         </w:rPr>
-        <w:t xml:space="preserve">(beta </w:t>
+        <w:t xml:space="preserve"> </w:t>
       </w:r>
       <w:r>
         <w:rPr>
           <w:rStyle w:val="NormalTok"/>
         </w:rPr>
+        <w:t>FALSE</w:t>
+      </w:r>
+      <w:r>
+        <w:rPr>
+          <w:rStyle w:val="NormalTok"/>
+        </w:rPr>
+        <w:t>)</w:t>
+      </w:r>
+      <w:r>
+        <w:rPr>
+          <w:rStyle w:val="NormalTok"/>
+        </w:rPr>
+        <w:br/>
+      </w:r>
+      <w:r>
+        <w:br/>
+      </w:r>
+      <w:r>
+        <w:rPr>
+          <w:rStyle w:val="CommentTok"/>
+        </w:rPr>
+        <w:t># Recenter baseline hazard</w:t>
+      </w:r>
+      <w:r>
+        <w:br/>
+      </w:r>
+      <w:r>
+        <w:rPr>
+          <w:rStyle w:val="NormalTok"/>
+        </w:rPr>
+        <w:t>base_haz</w:t>
+      </w:r>
+      <w:r>
+        <w:rPr>
+          <w:rStyle w:val="NormalTok"/>
+        </w:rPr>
+        <w:t>$</w:t>
+      </w:r>
+      <w:r>
+        <w:rPr>
+          <w:rStyle w:val="NormalTok"/>
+        </w:rPr>
+        <w:t xml:space="preserve">hazard_centered </w:t>
+      </w:r>
+      <w:r>
+        <w:rPr>
+          <w:rStyle w:val="NormalTok"/>
+        </w:rPr>
+        <w:t>&lt;-</w:t>
+      </w:r>
+      <w:r>
+        <w:rPr>
+          <w:rStyle w:val="NormalTok"/>
+        </w:rPr>
+        <w:t xml:space="preserve"> base_haz</w:t>
+      </w:r>
+      <w:r>
+        <w:rPr>
+          <w:rStyle w:val="NormalTok"/>
+        </w:rPr>
+        <w:t>$</w:t>
+      </w:r>
+      <w:r>
+        <w:rPr>
+          <w:rStyle w:val="NormalTok"/>
+        </w:rPr>
+        <w:t xml:space="preserve">hazard </w:t>
+      </w:r>
+      <w:r>
+        <w:rPr>
+          <w:rStyle w:val="NormalTok"/>
+        </w:rPr>
         <w:t>*</w:t>
       </w:r>
       <w:r>
         <w:rPr>
           <w:rStyle w:val="NormalTok"/>
         </w:rPr>
-        <w:t xml:space="preserve"> </w:t>
-      </w:r>
-      <w:proofErr w:type="spellStart"/>
-      <w:r>
-        <w:rPr>
-          <w:rStyle w:val="NormalTok"/>
-        </w:rPr>
-        <w:t>Xbar</w:t>
-      </w:r>
-      <w:proofErr w:type="spellEnd"/>
-      <w:r>
-        <w:rPr>
-          <w:rStyle w:val="NormalTok"/>
-        </w:rPr>
-        <w:t>))</w:t>
-      </w:r>
-      <w:r>
-        <w:rPr>
-          <w:rStyle w:val="NormalTok"/>
-        </w:rPr>
-        <w:br/>
-      </w:r>
-      <w:r>
-        <w:br/>
-      </w:r>
-      <w:r>
-        <w:rPr>
-          <w:rStyle w:val="CommentTok"/>
-        </w:rPr>
-        <w:t># Get baseline hazard from the fitted model</w:t>
-      </w:r>
-      <w:r>
-        <w:br/>
-      </w:r>
-      <w:proofErr w:type="spellStart"/>
-      <w:r>
-        <w:rPr>
-          <w:rStyle w:val="NormalTok"/>
-        </w:rPr>
-        <w:t>base_haz</w:t>
-      </w:r>
-      <w:proofErr w:type="spellEnd"/>
-      <w:r>
-        <w:rPr>
-          <w:rStyle w:val="NormalTok"/>
-        </w:rPr>
-        <w:t xml:space="preserve"> </w:t>
-      </w:r>
-      <w:r>
-        <w:rPr>
-          <w:rStyle w:val="NormalTok"/>
-        </w:rPr>
-        <w:t>&lt;-</w:t>
-      </w:r>
-      <w:r>
-        <w:rPr>
-          <w:rStyle w:val="NormalTok"/>
-        </w:rPr>
-        <w:t xml:space="preserve"> </w:t>
-      </w:r>
-      <w:proofErr w:type="spellStart"/>
-      <w:r>
-        <w:rPr>
-          <w:rStyle w:val="NormalTok"/>
-        </w:rPr>
-        <w:t>basehaz</w:t>
-      </w:r>
-      <w:proofErr w:type="spellEnd"/>
-      <w:r>
-        <w:rPr>
-          <w:rStyle w:val="NormalTok"/>
-        </w:rPr>
-        <w:t xml:space="preserve">(fit, </w:t>
-      </w:r>
-      <w:r>
-        <w:rPr>
-          <w:rStyle w:val="NormalTok"/>
-        </w:rPr>
-        <w:t>centered =</w:t>
-      </w:r>
-      <w:r>
-        <w:rPr>
-          <w:rStyle w:val="NormalTok"/>
-        </w:rPr>
-        <w:t xml:space="preserve"> </w:t>
-      </w:r>
-      <w:r>
-        <w:rPr>
-          <w:rStyle w:val="NormalTok"/>
-        </w:rPr>
-        <w:t>FALSE</w:t>
-      </w:r>
-      <w:r>
-        <w:rPr>
-          <w:rStyle w:val="NormalTok"/>
-        </w:rPr>
-        <w:t>)</w:t>
-      </w:r>
-      <w:r>
-        <w:rPr>
-          <w:rStyle w:val="NormalTok"/>
-        </w:rPr>
-        <w:br/>
-      </w:r>
-      <w:r>
-        <w:br/>
-      </w:r>
-      <w:r>
-        <w:rPr>
-          <w:rStyle w:val="CommentTok"/>
-        </w:rPr>
-        <w:t># Recenter baseline hazard</w:t>
-      </w:r>
-      <w:r>
-        <w:br/>
-      </w:r>
-      <w:proofErr w:type="spellStart"/>
-      <w:r>
-        <w:rPr>
-          <w:rStyle w:val="NormalTok"/>
-        </w:rPr>
-        <w:t>base_haz</w:t>
-      </w:r>
-      <w:r>
-        <w:rPr>
-          <w:rStyle w:val="NormalTok"/>
-        </w:rPr>
-        <w:t>$</w:t>
-      </w:r>
-      <w:r>
-        <w:rPr>
-          <w:rStyle w:val="NormalTok"/>
-        </w:rPr>
-        <w:t>hazard_centered</w:t>
-      </w:r>
-      <w:proofErr w:type="spellEnd"/>
-      <w:r>
-        <w:rPr>
-          <w:rStyle w:val="NormalTok"/>
-        </w:rPr>
-        <w:t xml:space="preserve"> </w:t>
-      </w:r>
-      <w:r>
-        <w:rPr>
-          <w:rStyle w:val="NormalTok"/>
-        </w:rPr>
-        <w:t>&lt;-</w:t>
-      </w:r>
-      <w:r>
-        <w:rPr>
-          <w:rStyle w:val="NormalTok"/>
-        </w:rPr>
-        <w:t xml:space="preserve"> </w:t>
-      </w:r>
-      <w:proofErr w:type="spellStart"/>
-      <w:r>
-        <w:rPr>
-          <w:rStyle w:val="NormalTok"/>
-        </w:rPr>
-        <w:t>base_haz</w:t>
-      </w:r>
-      <w:r>
-        <w:rPr>
-          <w:rStyle w:val="NormalTok"/>
-        </w:rPr>
-        <w:t>$</w:t>
-      </w:r>
-      <w:r>
-        <w:rPr>
-          <w:rStyle w:val="NormalTok"/>
-        </w:rPr>
-        <w:t>hazard</w:t>
-      </w:r>
-      <w:proofErr w:type="spellEnd"/>
-      <w:r>
-        <w:rPr>
-          <w:rStyle w:val="NormalTok"/>
-        </w:rPr>
-        <w:t xml:space="preserve"> </w:t>
-      </w:r>
-      <w:r>
-        <w:rPr>
-          <w:rStyle w:val="NormalTok"/>
-        </w:rPr>
-        <w:t>*</w:t>
-      </w:r>
-      <w:r>
-        <w:rPr>
-          <w:rStyle w:val="NormalTok"/>
-        </w:rPr>
-        <w:t xml:space="preserve"> </w:t>
-      </w:r>
-      <w:proofErr w:type="spellStart"/>
-      <w:r>
-        <w:rPr>
-          <w:rStyle w:val="NormalTok"/>
-        </w:rPr>
-        <w:t>scale_factor</w:t>
-      </w:r>
-      <w:proofErr w:type="spellEnd"/>
+        <w:t xml:space="preserve"> scale_factor</w:t>
+      </w:r>
       <w:r>
         <w:rPr>
           <w:rStyle w:val="NormalTok"/>
@@ -21579,21 +21354,7 @@
         <w:rPr>
           <w:rStyle w:val="NormalTok"/>
         </w:rPr>
-        <w:t>(</w:t>
-      </w:r>
-      <w:proofErr w:type="spellStart"/>
-      <w:r>
-        <w:rPr>
-          <w:rStyle w:val="NormalTok"/>
-        </w:rPr>
-        <w:t>base_haz</w:t>
-      </w:r>
-      <w:proofErr w:type="spellEnd"/>
-      <w:r>
-        <w:rPr>
-          <w:rStyle w:val="NormalTok"/>
-        </w:rPr>
-        <w:t>)</w:t>
+        <w:t>(base_haz)</w:t>
       </w:r>
     </w:p>
     <w:p>
@@ -21806,23 +21567,7 @@
                 <w:sz w:val="20"/>
                 <w:szCs w:val="20"/>
               </w:rPr>
-              <w:t xml:space="preserve">Intercept = </w:t>
-            </w:r>
-            <w:proofErr w:type="gramStart"/>
-            <w:r>
-              <w:rPr>
-                <w:sz w:val="20"/>
-                <w:szCs w:val="20"/>
-              </w:rPr>
-              <w:t>logit(p(</w:t>
-            </w:r>
-            <w:proofErr w:type="gramEnd"/>
-            <w:r>
-              <w:rPr>
-                <w:sz w:val="20"/>
-                <w:szCs w:val="20"/>
-              </w:rPr>
-              <w:t>mean X))</w:t>
+              <w:t>Intercept = logit(p(mean X))</w:t>
             </w:r>
           </w:p>
         </w:tc>
@@ -21887,23 +21632,7 @@
                 <w:sz w:val="20"/>
                 <w:szCs w:val="20"/>
               </w:rPr>
-              <w:t xml:space="preserve">Baseline hazard × </w:t>
-            </w:r>
-            <w:proofErr w:type="gramStart"/>
-            <w:r>
-              <w:rPr>
-                <w:sz w:val="20"/>
-                <w:szCs w:val="20"/>
-              </w:rPr>
-              <w:t>exp(</w:t>
-            </w:r>
-            <w:proofErr w:type="gramEnd"/>
-            <w:r>
-              <w:rPr>
-                <w:sz w:val="20"/>
-                <w:szCs w:val="20"/>
-              </w:rPr>
-              <w:t>βᵗ X̄)</w:t>
+              <w:t>Baseline hazard × exp(βᵗ X̄)</w:t>
             </w:r>
           </w:p>
         </w:tc>
@@ -22033,12 +21762,12 @@
 <w:numbering xmlns:wpc="http://schemas.microsoft.com/office/word/2010/wordprocessingCanvas" xmlns:cx="http://schemas.microsoft.com/office/drawing/2014/chartex" xmlns:cx1="http://schemas.microsoft.com/office/drawing/2015/9/8/chartex" xmlns:cx2="http://schemas.microsoft.com/office/drawing/2015/10/21/chartex" xmlns:cx3="http://schemas.microsoft.com/office/drawing/2016/5/9/chartex" xmlns:cx4="http://schemas.microsoft.com/office/drawing/2016/5/10/chartex" xmlns:cx5="http://schemas.microsoft.com/office/drawing/2016/5/11/chartex" xmlns:cx6="http://schemas.microsoft.com/office/drawing/2016/5/12/chartex" xmlns:cx7="http://schemas.microsoft.com/office/drawing/2016/5/13/chartex" xmlns:cx8="http://schemas.microsoft.com/office/drawing/2016/5/14/chartex" xmlns:mc="http://schemas.openxmlformats.org/markup-compatibility/2006" xmlns:aink="http://schemas.microsoft.com/office/drawing/2016/ink" xmlns:am3d="http://schemas.microsoft.com/office/drawing/2017/model3d" xmlns:o="urn:schemas-microsoft-com:office:office" xmlns:oel="http://schemas.microsoft.com/office/2019/extlst" xmlns:r="http://schemas.openxmlformats.org/officeDocument/2006/relationships" xmlns:m="http://schemas.openxmlformats.org/officeDocument/2006/math" xmlns:v="urn:schemas-microsoft-com:vml" xmlns:wp14="http://schemas.microsoft.com/office/word/2010/wordprocessingDrawing" xmlns:wp="http://schemas.openxmlformats.org/drawingml/2006/wordprocessingDrawing" xmlns:w10="urn:schemas-microsoft-com:office:word" xmlns:w="http://schemas.openxmlformats.org/wordprocessingml/2006/main" xmlns:w14="http://schemas.microsoft.com/office/word/2010/wordml" xmlns:w15="http://schemas.microsoft.com/office/word/2012/wordml" xmlns:w16cex="http://schemas.microsoft.com/office/word/2018/wordml/cex" xmlns:w16cid="http://schemas.microsoft.com/office/word/2016/wordml/cid" xmlns:w16="http://schemas.microsoft.com/office/word/2018/wordml" xmlns:w16du="http://schemas.microsoft.com/office/word/2023/wordml/word16du" xmlns:w16sdtdh="http://schemas.microsoft.com/office/word/2020/wordml/sdtdatahash" xmlns:w16sdtfl="http://schemas.microsoft.com/office/word/2024/wordml/sdtformatlock" xmlns:w16se="http://schemas.microsoft.com/office/word/2015/wordml/symex" xmlns:wpg="http://schemas.microsoft.com/office/word/2010/wordprocessingGroup" xmlns:wpi="http://schemas.microsoft.com/office/word/2010/wordprocessingInk" xmlns:wne="http://schemas.microsoft.com/office/word/2006/wordml" xmlns:wps="http://schemas.microsoft.com/office/word/2010/wordprocessingShape" mc:Ignorable="w14 w15 w16se w16cid w16 w16cex w16sdtdh w16sdtfl w16du wp14">
   <w:numPicBullet w:numPicBulletId="0">
     <w:pict>
-      <v:rect id="_x0000_i1041" style="width:0;height:1.5pt" o:hralign="center" o:bullet="t" o:hrstd="t" o:hr="t"/>
+      <v:rect id="_x0000_i1025" style="width:0;height:1.5pt" o:hralign="center" o:bullet="t" o:hrstd="t" o:hr="t"/>
     </w:pict>
   </w:numPicBullet>
   <w:numPicBullet w:numPicBulletId="1">
     <w:pict>
-      <v:rect id="_x0000_i1042" style="width:0;height:1.5pt" o:hralign="center" o:bullet="t" o:hrstd="t" o:hr="t"/>
+      <v:rect id="_x0000_i1026" style="width:0;height:1.5pt" o:hralign="center" o:bullet="t" o:hrstd="t" o:hr="t"/>
     </w:pict>
   </w:numPicBullet>
   <w:abstractNum w:abstractNumId="0" w15:restartNumberingAfterBreak="0">

</xml_diff>